<commit_message>
Ada Koch I (Orkney): la cala es Selkie Geo, «the geo»
Co-Authored-By: Claude Opus 5.5 <noreply@anthropic.com>
Claude-Session: https://claude.ai/code/session_01HymiadRDUPzWBtequ8tm6m
</commit_message>
<xml_diff>
--- a/ada_koch/libro_1/en_gb/The_Lovers_of_the_Spiral.docx
+++ b/ada_koch/libro_1/en_gb/The_Lovers_of_the_Spiral.docx
@@ -195,7 +195,20 @@
         <w:pStyle w:val="FirstParagraph"/>
       </w:pPr>
       <w:r>
-        <w:t xml:space="preserve">The path down to the cove runs between heather and loose stones. At this hour it’s still night, so I wear a head torch, like a miner. I know by heart the three spots where, if you put a foot wrong, you go over. The first few months I went down with my heart in my mouth. Now I go down thinking about other things.</w:t>
+        <w:t xml:space="preserve">The path down to the geo runs between heather and loose stones. On the Ordnance Survey map it says</w:t>
+      </w:r>
+      <w:r>
+        <w:t xml:space="preserve"> </w:t>
+      </w:r>
+      <w:r>
+        <w:rPr>
+          <w:iCs/>
+          <w:i/>
+        </w:rPr>
+        <w:t xml:space="preserve">Selkie Geo</w:t>
+      </w:r>
+      <w:r>
+        <w:t xml:space="preserve">; nobody here calls it anything but the geo, a cleft in the cliff with a scrap of shingle at the bottom. At this hour it’s still night, so I wear a head torch, like a miner. I know by heart the three spots where, if you put a foot wrong, you go over. The first few months I went down with my heart in my mouth. Now I go down thinking about other things.</w:t>
       </w:r>
     </w:p>
     <w:p>
@@ -1537,7 +1550,7 @@
         <w:pStyle w:val="BodyText"/>
       </w:pPr>
       <w:r>
-        <w:t xml:space="preserve">I laugh. It’s true. I went down to the cove at seven, though the sea was already too rough to swim far. I only went in up to my waist. But I went in.</w:t>
+        <w:t xml:space="preserve">I laugh. It’s true. I went down to the geo at seven, though the sea was already too rough to swim far. I only went in up to my waist. But I went in.</w:t>
       </w:r>
     </w:p>
     <w:p>
@@ -3188,7 +3201,7 @@
         <w:pStyle w:val="BodyText"/>
       </w:pPr>
       <w:r>
-        <w:t xml:space="preserve">Before it gets dark I go down to the cove one last time.</w:t>
+        <w:t xml:space="preserve">Before it gets dark I go down to the geo one last time.</w:t>
       </w:r>
     </w:p>
     <w:p>
@@ -3273,7 +3286,7 @@
         <w:pStyle w:val="BodyText"/>
       </w:pPr>
       <w:r>
-        <w:t xml:space="preserve">It can’t be. At nine I had never been out to Breckness. Holidays at my grandmother’s were down by the harbour, or at Warebeth, on the town side of the headland. I had never climbed up to the lighthouse. I had never come down to this cove.</w:t>
+        <w:t xml:space="preserve">It can’t be. At nine I had never been out to Breckness. Holidays at my grandmother’s were down by the harbour, or at Warebeth, on the town side of the headland. I had never climbed up to the lighthouse. I had never come down to this geo.</w:t>
       </w:r>
     </w:p>
     <w:p>
@@ -4541,7 +4554,7 @@
         <w:pStyle w:val="BodyText"/>
       </w:pPr>
       <w:r>
-        <w:t xml:space="preserve">I untie one of the ropes of the cover and lift the canvas by a corner.</w:t>
+        <w:t xml:space="preserve">I untie one of the ropes of the geor and lift the canvas by a corner.</w:t>
       </w:r>
     </w:p>
     <w:p>
@@ -10272,7 +10285,7 @@
         <w:t xml:space="preserve">‘</w:t>
       </w:r>
       <w:r>
-        <w:t xml:space="preserve">When the storm passes, I’ll take you to the cove. I’ll teach you to swim.</w:t>
+        <w:t xml:space="preserve">When the storm passes, I’ll take you to the geo. I’ll teach you to swim.</w:t>
       </w:r>
       <w:r>
         <w:t xml:space="preserve">’</w:t>
@@ -13190,7 +13203,7 @@
         <w:pStyle w:val="BodyText"/>
       </w:pPr>
       <w:r>
-        <w:t xml:space="preserve">Not because of him. Because of the sea. After a storm like that, the cove takes a while to settle. The water stays murky, churned up, with a groundswell that pulls at your ankles even when the surface looks calm. I know because I check it every morning from the window, with my coffee, while he sleeps on the sofa with his feet hanging off the end.</w:t>
+        <w:t xml:space="preserve">Not because of him. Because of the sea. After a storm like that, the geo takes a while to settle. The water stays murky, churned up, with a groundswell that pulls at your ankles even when the surface looks calm. I know because I check it every morning from the window, with my coffee, while he sleeps on the sofa with his feet hanging off the end.</w:t>
       </w:r>
     </w:p>
     <w:p>
@@ -13341,7 +13354,7 @@
         <w:pStyle w:val="BodyText"/>
       </w:pPr>
       <w:r>
-        <w:t xml:space="preserve">I turn round. He has stopped at the bend where you can see the whole cove. He’s standing still, his hands in the pockets of his new trousers, looking at the water.</w:t>
+        <w:t xml:space="preserve">I turn round. He has stopped at the bend where you can see the whole geo. He’s standing still, his hands in the pockets of his new trousers, looking at the water.</w:t>
       </w:r>
     </w:p>
     <w:p>
@@ -13392,7 +13405,7 @@
         <w:pStyle w:val="FirstParagraph"/>
       </w:pPr>
       <w:r>
-        <w:t xml:space="preserve">There’s an odd silence in the cove, a Sunday silence. Not even gulls. Only the water breaking softly on the shore, with a sound like pots and pans.</w:t>
+        <w:t xml:space="preserve">There’s an odd silence in the geo, a Sunday silence. Not even gulls. Only the water breaking softly on the shore, with a sound like pots and pans.</w:t>
       </w:r>
     </w:p>
     <w:p>
@@ -13752,7 +13765,7 @@
         <w:pStyle w:val="BodyText"/>
       </w:pPr>
       <w:r>
-        <w:t xml:space="preserve">It slips out. I realise as soon as I’ve said it. He looks at me for the first time since we reached the cove, with something new in his eyes.</w:t>
+        <w:t xml:space="preserve">It slips out. I realise as soon as I’ve said it. He looks at me for the first time since we reached the geo, with something new in his eyes.</w:t>
       </w:r>
     </w:p>
     <w:p>
@@ -13923,7 +13936,7 @@
         <w:pStyle w:val="BodyText"/>
       </w:pPr>
       <w:r>
-        <w:t xml:space="preserve">It isn’t big. It’s a groundswell wave, the kind the storm leaves behind, that rises out of nowhere in a calm cove. It catches me from the side, pulls me under, tumbles me against the sand. I swallow water. I come up coughing, laughing, my hair in my face, perfectly fine.</w:t>
+        <w:t xml:space="preserve">It isn’t big. It’s a groundswell wave, the kind the storm leaves behind, that rises out of nowhere in a calm geo. It catches me from the side, pulls me under, tumbles me against the sand. I swallow water. I come up coughing, laughing, my hair in my face, perfectly fine.</w:t>
       </w:r>
     </w:p>
     <w:p>
@@ -14056,7 +14069,7 @@
         <w:pStyle w:val="BodyText"/>
       </w:pPr>
       <w:r>
-        <w:t xml:space="preserve">The cold, the fright, the tension, all of it bursts out of me in a peal of laughter that echoes round the whole cove. He watches me laugh with an offended look, his hair plastered to his forehead and his brows drawn together, and that makes me laugh even harder.</w:t>
+        <w:t xml:space="preserve">The cold, the fright, the tension, all of it bursts out of me in a peal of laughter that echoes round the whole geo. He watches me laugh with an offended look, his hair plastered to his forehead and his brows drawn together, and that makes me laugh even harder.</w:t>
       </w:r>
     </w:p>
     <w:p>
@@ -14255,7 +14268,7 @@
         <w:pStyle w:val="BodyText"/>
       </w:pPr>
       <w:r>
-        <w:t xml:space="preserve">At the bend where you can see the cove, he stops. He turns to look at the sea, smooth again now, innocent, as if nothing had happened.</w:t>
+        <w:t xml:space="preserve">At the bend where you can see the geo, he stops. He turns to look at the sea, smooth again now, innocent, as if nothing had happened.</w:t>
       </w:r>
     </w:p>
     <w:p>
@@ -17405,7 +17418,7 @@
         <w:pStyle w:val="BodyText"/>
       </w:pPr>
       <w:r>
-        <w:t xml:space="preserve">Two strokes. One on each side. The corner lifting all the way. A little shading on the cheek, where the dimple shows when he laughs. A whole smile, open, the one I saw on him in the water of the cove before he sneezed.</w:t>
+        <w:t xml:space="preserve">Two strokes. One on each side. The corner lifting all the way. A little shading on the cheek, where the dimple shows when he laughs. A whole smile, open, the one I saw on him in the water of the geo before he sneezed.</w:t>
       </w:r>
     </w:p>
     <w:p>
@@ -19846,7 +19859,7 @@
         <w:pStyle w:val="BodyText"/>
       </w:pPr>
       <w:r>
-        <w:t xml:space="preserve">His face in the water of the cove, his hair plastered to his forehead.</w:t>
+        <w:t xml:space="preserve">His face in the water of the geo, his hair plastered to his forehead.</w:t>
       </w:r>
     </w:p>
     <w:p>
@@ -22300,7 +22313,7 @@
         <w:pStyle w:val="BodyText"/>
       </w:pPr>
       <w:r>
-        <w:t xml:space="preserve">There’s no other way to say it. Four days of kisses in the kitchen with the coffee pot bubbling. Of kisses on the tower stairs, on step fifty-seven, which has become our step because that’s where he caught up with me the first time I ran up. Of kisses in the cove, with the water up to our knees, him shivering with cold and denying he’s cold.</w:t>
+        <w:t xml:space="preserve">There’s no other way to say it. Four days of kisses in the kitchen with the coffee pot bubbling. Of kisses on the tower stairs, on step fifty-seven, which has become our step because that’s where he caught up with me the first time I ran up. Of kisses in the geo, with the water up to our knees, him shivering with cold and denying he’s cold.</w:t>
       </w:r>
     </w:p>
     <w:p>
@@ -23249,7 +23262,7 @@
         <w:pStyle w:val="BodyText"/>
       </w:pPr>
       <w:r>
-        <w:t xml:space="preserve">When I turn off the tap and turn round, he isn’t in the kitchen any more. I hear the front door. Through the window I see him going down the path to the cove, his hands in his pockets, no jacket, towards the sea that frightens him.</w:t>
+        <w:t xml:space="preserve">When I turn off the tap and turn round, he isn’t in the kitchen any more. I hear the front door. Through the window I see him going down the path to the geo, his hands in his pockets, no jacket, towards the sea that frightens him.</w:t>
       </w:r>
     </w:p>
     <w:p>
@@ -23516,7 +23529,7 @@
         <w:pStyle w:val="FirstParagraph"/>
       </w:pPr>
       <w:r>
-        <w:t xml:space="preserve">I don’t follow him to the cove. I put on my boots and my coat and go out the other way, along the cliff path that runs east, towards Warebeth.</w:t>
+        <w:t xml:space="preserve">I don’t follow him to the geo. I put on my boots and my coat and go out the other way, along the cliff path that runs east, towards Warebeth.</w:t>
       </w:r>
     </w:p>
     <w:p>
@@ -23558,7 +23571,7 @@
         <w:pStyle w:val="BodyText"/>
       </w:pPr>
       <w:r>
-        <w:t xml:space="preserve">About Iter going down to the cove without a jacket. About the sketchbook locked in the iron trunk. About the key, which I wear round my neck on a string, under my jumper, and which I can feel cold against my skin.</w:t>
+        <w:t xml:space="preserve">About Iter going down to the geo without a jacket. About the sketchbook locked in the iron trunk. About the key, which I wear round my neck on a string, under my jumper, and which I can feel cold against my skin.</w:t>
       </w:r>
     </w:p>
     <w:p>
@@ -24234,7 +24247,7 @@
         <w:t xml:space="preserve">‘</w:t>
       </w:r>
       <w:r>
-        <w:t xml:space="preserve">I’m diving off the rocks in your cove. There’s good scallops there. In case you see a man going over the side of a boat and get a fright.</w:t>
+        <w:t xml:space="preserve">I’m diving off the rocks in your geo. There’s good scallops there. In case you see a man going over the side of a boat and get a fright.</w:t>
       </w:r>
       <w:r>
         <w:t xml:space="preserve">’</w:t>
@@ -25441,7 +25454,7 @@
         <w:pStyle w:val="BodyText"/>
       </w:pPr>
       <w:r>
-        <w:t xml:space="preserve">In the cove, the sea looks calm.</w:t>
+        <w:t xml:space="preserve">In the geo, the sea looks calm.</w:t>
       </w:r>
     </w:p>
     <w:p>
@@ -25586,7 +25599,7 @@
         <w:pStyle w:val="BodyText"/>
       </w:pPr>
       <w:r>
-        <w:t xml:space="preserve">Not towards the shore. Outwards. Towards the side of the rock, where the cove opens onto the Sound. A slow, enormous current that can’t be seen from above and that takes hold of my legs like a hand.</w:t>
+        <w:t xml:space="preserve">Not towards the shore. Outwards. Towards the side of the rock, where the geo opens onto the Sound. A slow, enormous current that can’t be seen from above and that takes hold of my legs like a hand.</w:t>
       </w:r>
     </w:p>
     <w:p>
@@ -26113,7 +26126,7 @@
         <w:pStyle w:val="BodyText"/>
       </w:pPr>
       <w:r>
-        <w:t xml:space="preserve">I open my eyes. Everything is grey and blurred and full of salt. But I see the orange. An orange drysuit, streaming, on a body kneeling beside me on the stones of the cove. I see a bearded face running with water. Light eyes, wide open, with something in them I’ve never seen there before.</w:t>
+        <w:t xml:space="preserve">I open my eyes. Everything is grey and blurred and full of salt. But I see the orange. An orange drysuit, streaming, on a body kneeling beside me on the stones of the geo. I see a bearded face running with water. Light eyes, wide open, with something in them I’ve never seen there before.</w:t>
       </w:r>
     </w:p>
     <w:p>
@@ -27078,7 +27091,7 @@
           <w:iCs/>
           <w:i/>
         </w:rPr>
-        <w:t xml:space="preserve">Gone to get your things from the cove. Back soon. Don’t leave without eating.</w:t>
+        <w:t xml:space="preserve">Gone to get your things from the geo. Back soon. Don’t leave without eating.</w:t>
       </w:r>
     </w:p>
     <w:p>
@@ -27498,7 +27511,7 @@
         <w:pStyle w:val="BodyText"/>
       </w:pPr>
       <w:r>
-        <w:t xml:space="preserve">He doesn’t ask why. He stops the van on the verge, hands me the bag with my coat and my boots, collected from the cove, and sits looking straight ahead with his hands on the wheel.</w:t>
+        <w:t xml:space="preserve">He doesn’t ask why. He stops the van on the verge, hands me the bag with my coat and my boots, collected from the geo, and sits looking straight ahead with his hands on the wheel.</w:t>
       </w:r>
     </w:p>
     <w:p>
@@ -27633,7 +27646,7 @@
         <w:pStyle w:val="BodyText"/>
       </w:pPr>
       <w:r>
-        <w:t xml:space="preserve">I see him before I reach the clearing. He isn’t in the house. He’s at the edge of the cliff, where the path down to the cove begins. Standing. His back to me. Looking at the sea.</w:t>
+        <w:t xml:space="preserve">I see him before I reach the clearing. He isn’t in the house. He’s at the edge of the cliff, where the path down to the geo begins. Standing. His back to me. Looking at the sea.</w:t>
       </w:r>
     </w:p>
     <w:p>
@@ -29455,7 +29468,7 @@
         <w:pStyle w:val="BodyText"/>
       </w:pPr>
       <w:r>
-        <w:t xml:space="preserve">Laughing with my mouth open, my eyes closed, my head thrown back. A huge laugh, overflowing, the kind that doesn’t fit on your face. The one from the cove, the day he sneezed. The one from Lucía’s green face mask.</w:t>
+        <w:t xml:space="preserve">Laughing with my mouth open, my eyes closed, my head thrown back. A huge laugh, overflowing, the kind that doesn’t fit on your face. The one from the geo, the day he sneezed. The one from Lucía’s green face mask.</w:t>
       </w:r>
     </w:p>
     <w:p>
@@ -32915,7 +32928,7 @@
         <w:pStyle w:val="BodyText"/>
       </w:pPr>
       <w:r>
-        <w:t xml:space="preserve">A blue cardboard folder, old, with broken corners and a handwritten label on the cover, in my ten-year-old handwriting.</w:t>
+        <w:t xml:space="preserve">A blue cardboard folder, old, with broken corners and a handwritten label on the geor, in my ten-year-old handwriting.</w:t>
       </w:r>
     </w:p>
     <w:p>
@@ -34300,7 +34313,7 @@
         <w:pStyle w:val="BodyText"/>
       </w:pPr>
       <w:r>
-        <w:t xml:space="preserve">He is at the edge of the cliff. Where the path to the cove starts. Where I spent a whole day shouting Ada’s name.</w:t>
+        <w:t xml:space="preserve">He is at the edge of the cliff. Where the path to the geo starts. Where I spent a whole day shouting Ada’s name.</w:t>
       </w:r>
     </w:p>
     <w:p>
@@ -34743,7 +34756,7 @@
         <w:pStyle w:val="BodyText"/>
       </w:pPr>
       <w:r>
-        <w:t xml:space="preserve">I see her go down the path. Towards the cove. Towards the sea. In the dark. With the groundswell. Running after the white pages the wind is carrying towards the water.</w:t>
+        <w:t xml:space="preserve">I see her go down the path. Towards the geo. Towards the sea. In the dark. With the groundswell. Running after the white pages the wind is carrying towards the water.</w:t>
       </w:r>
     </w:p>
     <w:p>
@@ -35010,7 +35023,7 @@
         <w:pStyle w:val="BodyText"/>
       </w:pPr>
       <w:r>
-        <w:t xml:space="preserve">Down in the cove. Not in the water yet. Wedged between two stones at the water’s edge, open, its pages beating in the wind. Every time a wave comes in, the foam licks it. Every time it pulls back, it tugs at it.</w:t>
+        <w:t xml:space="preserve">Down in the geo. Not in the water yet. Wedged between two stones at the water’s edge, open, its pages beating in the wind. Every time a wave comes in, the foam licks it. Every time it pulls back, it tugs at it.</w:t>
       </w:r>
     </w:p>
     <w:p>
@@ -35208,7 +35221,7 @@
         <w:pStyle w:val="BodyText"/>
       </w:pPr>
       <w:r>
-        <w:t xml:space="preserve">He’s afraid of the sea. He has always been afraid of it. I saw it in his eyes, in the cove, that first day, in his new trainers. And he’s in it. In a heavy swell. Being erased. Afraid.</w:t>
+        <w:t xml:space="preserve">He’s afraid of the sea. He has always been afraid of it. I saw it in his eyes, in the geo, that first day, in his new trainers. And he’s in it. In a heavy swell. Being erased. Afraid.</w:t>
       </w:r>
     </w:p>
     <w:p>
@@ -35464,7 +35477,7 @@
         <w:pStyle w:val="BodyText"/>
       </w:pPr>
       <w:r>
-        <w:t xml:space="preserve">Up above. On the cliff. A torch, a strong one, sweeping the rocks, the water, the cove. And a voice, shouting my name over the wind.</w:t>
+        <w:t xml:space="preserve">Up above. On the cliff. A torch, a strong one, sweeping the rocks, the water, the geo. And a voice, shouting my name over the wind.</w:t>
       </w:r>
     </w:p>
     <w:p>
@@ -37425,7 +37438,7 @@
         <w:t xml:space="preserve">‘</w:t>
       </w:r>
       <w:r>
-        <w:t xml:space="preserve">I went down to the rocks in your cove.</w:t>
+        <w:t xml:space="preserve">I went down to the rocks in your geo.</w:t>
       </w:r>
       <w:r>
         <w:t xml:space="preserve">’</w:t>
@@ -39657,7 +39670,7 @@
         <w:pStyle w:val="BodyText"/>
       </w:pPr>
       <w:r>
-        <w:t xml:space="preserve">Slowly. With a creak of old gears that grows smoother. And the light comes out through the glass rings as a beam, a long white arm that sweeps the sea, the rocks, the cove, the road, the town down below with its four lights, the hill, and comes back to the sea.</w:t>
+        <w:t xml:space="preserve">Slowly. With a creak of old gears that grows smoother. And the light comes out through the glass rings as a beam, a long white arm that sweeps the sea, the rocks, the geo, the road, the town down below with its four lights, the hill, and comes back to the sea.</w:t>
       </w:r>
     </w:p>
     <w:p>
@@ -40456,7 +40469,7 @@
         <w:t xml:space="preserve">”</w:t>
       </w:r>
       <w:r>
-        <w:t xml:space="preserve">. Ada’s name for the rock at the mouth of her cove.</w:t>
+        <w:t xml:space="preserve">. Ada’s name for the rock at the mouth of her geo.</w:t>
       </w:r>
     </w:p>
     <w:p>
@@ -41401,6 +41414,50 @@
       </w:r>
       <w:r>
         <w:t xml:space="preserve">— the town; in Orkney, Stromness or Kirkwall.</w:t>
+      </w:r>
+    </w:p>
+    <w:p>
+      <w:pPr>
+        <w:pStyle w:val="BodyText"/>
+      </w:pPr>
+      <w:r>
+        <w:rPr>
+          <w:iCs/>
+          <w:i/>
+        </w:rPr>
+        <w:t xml:space="preserve">geo</w:t>
+      </w:r>
+      <w:r>
+        <w:t xml:space="preserve"> </w:t>
+      </w:r>
+      <w:r>
+        <w:t xml:space="preserve">— a narrow inlet cut into a cliff, from the Old Norse</w:t>
+      </w:r>
+      <w:r>
+        <w:t xml:space="preserve"> </w:t>
+      </w:r>
+      <w:r>
+        <w:rPr>
+          <w:iCs/>
+          <w:i/>
+        </w:rPr>
+        <w:t xml:space="preserve">gjá</w:t>
+      </w:r>
+      <w:r>
+        <w:t xml:space="preserve">. Ada swims in</w:t>
+      </w:r>
+      <w:r>
+        <w:t xml:space="preserve"> </w:t>
+      </w:r>
+      <w:r>
+        <w:rPr>
+          <w:iCs/>
+          <w:i/>
+        </w:rPr>
+        <w:t xml:space="preserve">Selkie Geo</w:t>
+      </w:r>
+      <w:r>
+        <w:t xml:space="preserve">, below the lighthouse.</w:t>
       </w:r>
     </w:p>
     <w:p>

</xml_diff>

<commit_message>
Ada Koch I (Orkney): la roca a Vella pasa a ser the Auld Wife
Co-Authored-By: Claude Opus 5.5 <noreply@anthropic.com>
Claude-Session: https://claude.ai/code/session_01HymiadRDUPzWBtequ8tm6m
</commit_message>
<xml_diff>
--- a/ada_koch/libro_1/en_gb/The_Lovers_of_the_Spiral.docx
+++ b/ada_koch/libro_1/en_gb/The_Lovers_of_the_Spiral.docx
@@ -3217,23 +3217,7 @@
         <w:pStyle w:val="BodyText"/>
       </w:pPr>
       <w:r>
-        <w:t xml:space="preserve">I sit at the top of the path, on a flat stone, hugging my knees to my chest. The wind blows my hair into my face and makes my eyes water. Below,</w:t>
-      </w:r>
-      <w:r>
-        <w:t xml:space="preserve"> </w:t>
-      </w:r>
-      <w:r>
-        <w:rPr>
-          <w:iCs/>
-          <w:i/>
-        </w:rPr>
-        <w:t xml:space="preserve">a Vella</w:t>
-      </w:r>
-      <w:r>
-        <w:t xml:space="preserve"> </w:t>
-      </w:r>
-      <w:r>
-        <w:t xml:space="preserve">takes the blows of the waves, black and gleaming, unmoved, the way she’s been taking them since before Stromness existed.</w:t>
+        <w:t xml:space="preserve">I sit at the top of the path, on a flat stone, hugging my knees to my chest. The wind blows my hair into my face and makes my eyes water. Below, the Auld Wife takes the blows of the waves, black and gleaming, unmoved, the way she’s been taking them since before Stromness existed.</w:t>
       </w:r>
     </w:p>
     <w:p>
@@ -3249,20 +3233,7 @@
         <w:pStyle w:val="BodyText"/>
       </w:pPr>
       <w:r>
-        <w:t xml:space="preserve">A small rock, to the left of</w:t>
-      </w:r>
-      <w:r>
-        <w:t xml:space="preserve"> </w:t>
-      </w:r>
-      <w:r>
-        <w:rPr>
-          <w:iCs/>
-          <w:i/>
-        </w:rPr>
-        <w:t xml:space="preserve">a Vella</w:t>
-      </w:r>
-      <w:r>
-        <w:t xml:space="preserve">, half hidden in the foam. Round on top, flat, with a kind of step on one side, like a seat. I’ve been swimming here for a year and have never noticed it.</w:t>
+        <w:t xml:space="preserve">A small rock, to the left of the Auld Wife, half hidden in the foam. Round on top, flat, with a kind of step on one side, like a seat. I’ve been swimming here for a year and have never noticed it.</w:t>
       </w:r>
     </w:p>
     <w:p>
@@ -13864,23 +13835,7 @@
         <w:pStyle w:val="BodyText"/>
       </w:pPr>
       <w:r>
-        <w:t xml:space="preserve">I swim towards</w:t>
-      </w:r>
-      <w:r>
-        <w:t xml:space="preserve"> </w:t>
-      </w:r>
-      <w:r>
-        <w:rPr>
-          <w:iCs/>
-          <w:i/>
-        </w:rPr>
-        <w:t xml:space="preserve">a Vella</w:t>
-      </w:r>
-      <w:r>
-        <w:t xml:space="preserve"> </w:t>
-      </w:r>
-      <w:r>
-        <w:t xml:space="preserve">with furious strokes, splashing more than I need to. I’m thinking unfair things. That he’s a coward. That I made him, that I know what he’ll like. Who does he think he is, telling me no.</w:t>
+        <w:t xml:space="preserve">I swim towards the Auld Wife with furious strokes, splashing more than I need to. I’m thinking unfair things. That he’s a coward. That I made him, that I know what he’ll like. Who does he think he is, telling me no.</w:t>
       </w:r>
     </w:p>
     <w:p>
@@ -25570,20 +25525,7 @@
         <w:pStyle w:val="BodyText"/>
       </w:pPr>
       <w:r>
-        <w:t xml:space="preserve">I swim harder. Further. Towards</w:t>
-      </w:r>
-      <w:r>
-        <w:t xml:space="preserve"> </w:t>
-      </w:r>
-      <w:r>
-        <w:rPr>
-          <w:iCs/>
-          <w:i/>
-        </w:rPr>
-        <w:t xml:space="preserve">a Vella</w:t>
-      </w:r>
-      <w:r>
-        <w:t xml:space="preserve">.</w:t>
+        <w:t xml:space="preserve">I swim harder. Further. Towards the Auld Wife.</w:t>
       </w:r>
     </w:p>
     <w:p>
@@ -25670,17 +25612,7 @@
         <w:pStyle w:val="BodyText"/>
       </w:pPr>
       <w:r>
-        <w:rPr>
-          <w:iCs/>
-          <w:i/>
-        </w:rPr>
-        <w:t xml:space="preserve">A Vella</w:t>
-      </w:r>
-      <w:r>
-        <w:t xml:space="preserve"> </w:t>
-      </w:r>
-      <w:r>
-        <w:t xml:space="preserve">is on my left, black, enormous, with the waves smashing against her in white explosions.</w:t>
+        <w:t xml:space="preserve">The Auld Wife is on my left, black, enormous, with the waves smashing against her in white explosions.</w:t>
       </w:r>
     </w:p>
     <w:p>
@@ -35349,20 +35281,7 @@
         <w:pStyle w:val="BodyText"/>
       </w:pPr>
       <w:r>
-        <w:t xml:space="preserve">His. The small one, to the left of</w:t>
-      </w:r>
-      <w:r>
-        <w:t xml:space="preserve"> </w:t>
-      </w:r>
-      <w:r>
-        <w:rPr>
-          <w:iCs/>
-          <w:i/>
-        </w:rPr>
-        <w:t xml:space="preserve">a Vella</w:t>
-      </w:r>
-      <w:r>
-        <w:t xml:space="preserve">, the round one, the one with the step. The boy’s rock.</w:t>
+        <w:t xml:space="preserve">His. The small one, to the left of the Auld Wife, the round one, the one with the step. The boy’s rock.</w:t>
       </w:r>
     </w:p>
     <w:p>
@@ -40448,39 +40367,6 @@
           <w:iCs/>
           <w:i/>
         </w:rPr>
-        <w:t xml:space="preserve">a Vella</w:t>
-      </w:r>
-      <w:r>
-        <w:t xml:space="preserve"> </w:t>
-      </w:r>
-      <w:r>
-        <w:t xml:space="preserve">—</w:t>
-      </w:r>
-      <w:r>
-        <w:t xml:space="preserve"> </w:t>
-      </w:r>
-      <w:r>
-        <w:t xml:space="preserve">“</w:t>
-      </w:r>
-      <w:r>
-        <w:t xml:space="preserve">the Old Woman</w:t>
-      </w:r>
-      <w:r>
-        <w:t xml:space="preserve">”</w:t>
-      </w:r>
-      <w:r>
-        <w:t xml:space="preserve">. Ada’s name for the rock at the mouth of her geo.</w:t>
-      </w:r>
-    </w:p>
-    <w:p>
-      <w:pPr>
-        <w:pStyle w:val="BodyText"/>
-      </w:pPr>
-      <w:r>
-        <w:rPr>
-          <w:iCs/>
-          <w:i/>
-        </w:rPr>
         <w:t xml:space="preserve">alalá</w:t>
       </w:r>
       <w:r>
@@ -41414,6 +41300,39 @@
       </w:r>
       <w:r>
         <w:t xml:space="preserve">— the town; in Orkney, Stromness or Kirkwall.</w:t>
+      </w:r>
+    </w:p>
+    <w:p>
+      <w:pPr>
+        <w:pStyle w:val="BodyText"/>
+      </w:pPr>
+      <w:r>
+        <w:rPr>
+          <w:iCs/>
+          <w:i/>
+        </w:rPr>
+        <w:t xml:space="preserve">the Auld Wife</w:t>
+      </w:r>
+      <w:r>
+        <w:t xml:space="preserve"> </w:t>
+      </w:r>
+      <w:r>
+        <w:t xml:space="preserve">— Scots for</w:t>
+      </w:r>
+      <w:r>
+        <w:t xml:space="preserve"> </w:t>
+      </w:r>
+      <w:r>
+        <w:t xml:space="preserve">“</w:t>
+      </w:r>
+      <w:r>
+        <w:t xml:space="preserve">the old woman</w:t>
+      </w:r>
+      <w:r>
+        <w:t xml:space="preserve">”</w:t>
+      </w:r>
+      <w:r>
+        <w:t xml:space="preserve">: the black rock at the mouth of Selkie Geo.</w:t>
       </w:r>
     </w:p>
     <w:p>

</xml_diff>

<commit_message>
Ada Koch I (Orkney): compensaciones al diagnóstico del tercer acto
- Iter/Julian sin contracciones y con verbos llanos; el presente se enmarca como relato
  («I think I understand it now, while I tell it»).
- Anáfora del borrado restituida; «Now he returns it to me»; la risa que no cabe en la cara.
- «pin» para el nombre impuesto; «in the world that nobody drew».
- El conjunto de Julia se obtiene iterando: Iter → iteración → Julia → Julian.
- Maisie: la tawse en la escuela por hablar orcadiano; el alemán del cuaderno le enseña
  que sus palabras valen.

Co-Authored-By: Claude Opus 5.5 <noreply@anthropic.com>
Claude-Session: https://claude.ai/code/session_01HymiadRDUPzWBtequ8tm6m
</commit_message>
<xml_diff>
--- a/ada_koch/libro_1/en_gb/The_Lovers_of_the_Spiral.docx
+++ b/ada_koch/libro_1/en_gb/The_Lovers_of_the_Spiral.docx
@@ -28053,7 +28053,7 @@
         <w:pStyle w:val="BodyText"/>
       </w:pPr>
       <w:r>
-        <w:t xml:space="preserve">I watch him try. I watch the muscles in his neck tighten, his Adam’s apple move, his lips shape the A, the D, the A.</w:t>
+        <w:t xml:space="preserve">I watch him try. I watch the muscles of his neck go taut, I watch his Adam’s apple move, I watch his lips make the A, the D, the A.</w:t>
       </w:r>
     </w:p>
     <w:p>
@@ -28157,7 +28157,7 @@
         <w:pStyle w:val="BodyText"/>
       </w:pPr>
       <w:r>
-        <w:t xml:space="preserve">The same one I asked him the first day, on the doormat, when he was dripping wet and didn’t know who he was. Now he’s giving it back to me.</w:t>
+        <w:t xml:space="preserve">The same one I asked him the first day, on the doormat, when he was dripping wet and didn’t know who he was. Now he returns it to me.</w:t>
       </w:r>
     </w:p>
     <w:p>
@@ -28947,7 +28947,7 @@
         <w:pStyle w:val="BodyText"/>
       </w:pPr>
       <w:r>
-        <w:t xml:space="preserve">Laughing with my mouth open, my eyes closed, my head thrown back. A huge laugh, overflowing, the kind that doesn’t fit on your face. The one from the geo, the day he sneezed. The one from Lucy’s green face mask.</w:t>
+        <w:t xml:space="preserve">Laughing with my mouth open, my eyes closed, my head thrown back. A huge laugh, spilling over, the kind your face is too small to hold. The one from the geo, the day he sneezed. The one from Lucy’s green face mask.</w:t>
       </w:r>
     </w:p>
     <w:p>
@@ -30813,47 +30813,47 @@
         <w:pStyle w:val="FirstParagraph"/>
       </w:pPr>
       <w:r>
-        <w:t xml:space="preserve">The dog knows something I don’t know.</w:t>
-      </w:r>
-    </w:p>
-    <w:p>
-      <w:pPr>
-        <w:pStyle w:val="BodyText"/>
-      </w:pPr>
-      <w:r>
-        <w:t xml:space="preserve">That is the first thing I think when the van leaves and the man in the orange rain jacket takes away his father’s jumper and his dog, who keeps growling at me from the back window with the fur up on her back.</w:t>
-      </w:r>
-    </w:p>
-    <w:p>
-      <w:pPr>
-        <w:pStyle w:val="BodyText"/>
-      </w:pPr>
-      <w:r>
-        <w:t xml:space="preserve">Ada tells me not to pay attention to it. That dogs sometimes get scared of tall people, or of the smell of another house, or of nothing.</w:t>
-      </w:r>
-    </w:p>
-    <w:p>
-      <w:pPr>
-        <w:pStyle w:val="BodyText"/>
-      </w:pPr>
-      <w:r>
-        <w:t xml:space="preserve">I don’t believe her.</w:t>
-      </w:r>
-    </w:p>
-    <w:p>
-      <w:pPr>
-        <w:pStyle w:val="BodyText"/>
-      </w:pPr>
-      <w:r>
-        <w:t xml:space="preserve">Ada told me that dog lay belly-up for her on the sand at Warebeth, without knowing her at all. A dog like that doesn’t bare her teeth at anyone for nothing.</w:t>
-      </w:r>
-    </w:p>
-    <w:p>
-      <w:pPr>
-        <w:pStyle w:val="BodyText"/>
-      </w:pPr>
-      <w:r>
-        <w:t xml:space="preserve">She bared her teeth at me.</w:t>
+        <w:t xml:space="preserve">The dog knows something I do not know.</w:t>
+      </w:r>
+    </w:p>
+    <w:p>
+      <w:pPr>
+        <w:pStyle w:val="BodyText"/>
+      </w:pPr>
+      <w:r>
+        <w:t xml:space="preserve">That is the first thing I think when the van leaves and the man in the orange rain jacket takes away his father’s jumper and his dog, who growls and growls at me from the back window with the fur up on her back.</w:t>
+      </w:r>
+    </w:p>
+    <w:p>
+      <w:pPr>
+        <w:pStyle w:val="BodyText"/>
+      </w:pPr>
+      <w:r>
+        <w:t xml:space="preserve">Ada tells me not to listen to it. That dogs are sometimes afraid of tall people, or of the smell of another house, or of nothing.</w:t>
+      </w:r>
+    </w:p>
+    <w:p>
+      <w:pPr>
+        <w:pStyle w:val="BodyText"/>
+      </w:pPr>
+      <w:r>
+        <w:t xml:space="preserve">I do not believe her.</w:t>
+      </w:r>
+    </w:p>
+    <w:p>
+      <w:pPr>
+        <w:pStyle w:val="BodyText"/>
+      </w:pPr>
+      <w:r>
+        <w:t xml:space="preserve">Ada told me that dog lay belly-up for her on the sand at Warebeth, without knowing her at all. A dog like that does not show her teeth to anyone for nothing.</w:t>
+      </w:r>
+    </w:p>
+    <w:p>
+      <w:pPr>
+        <w:pStyle w:val="BodyText"/>
+      </w:pPr>
+      <w:r>
+        <w:t xml:space="preserve">She showed her teeth to me.</w:t>
       </w:r>
     </w:p>
     <w:p>
@@ -30884,7 +30884,7 @@
         <w:pStyle w:val="BodyText"/>
       </w:pPr>
       <w:r>
-        <w:t xml:space="preserve">And she didn’t like what she smelled.</w:t>
+        <w:t xml:space="preserve">And she did not like what she smelled.</w:t>
       </w:r>
     </w:p>
     <w:p>
@@ -30907,7 +30907,7 @@
         <w:pStyle w:val="BodyText"/>
       </w:pPr>
       <w:r>
-        <w:t xml:space="preserve">But I haven’t told her.</w:t>
+        <w:t xml:space="preserve">But I have not told her.</w:t>
       </w:r>
     </w:p>
     <w:p>
@@ -30941,7 +30941,7 @@
         <w:t xml:space="preserve">‘</w:t>
       </w:r>
       <w:r>
-        <w:t xml:space="preserve">I’m angry.</w:t>
+        <w:t xml:space="preserve">I am angry.</w:t>
       </w:r>
       <w:r>
         <w:t xml:space="preserve">’</w:t>
@@ -30981,18 +30981,18 @@
         <w:t xml:space="preserve">‘</w:t>
       </w:r>
       <w:r>
-        <w:t xml:space="preserve">It hasn’t gone away. I thought it would go away last night. It hasn’t gone away.</w:t>
-      </w:r>
-      <w:r>
-        <w:t xml:space="preserve">’</w:t>
-      </w:r>
-    </w:p>
-    <w:p>
-      <w:pPr>
-        <w:pStyle w:val="BodyText"/>
-      </w:pPr>
-      <w:r>
-        <w:t xml:space="preserve">She doesn’t turn round. I see her shoulders shaking.</w:t>
+        <w:t xml:space="preserve">It has not gone away. I thought it would go away last night. It has not gone away.</w:t>
+      </w:r>
+      <w:r>
+        <w:t xml:space="preserve">’</w:t>
+      </w:r>
+    </w:p>
+    <w:p>
+      <w:pPr>
+        <w:pStyle w:val="BodyText"/>
+      </w:pPr>
+      <w:r>
+        <w:t xml:space="preserve">She does not turn round. I see her shoulders shake.</w:t>
       </w:r>
     </w:p>
     <w:p>
@@ -31023,7 +31023,7 @@
         <w:t xml:space="preserve">‘</w:t>
       </w:r>
       <w:r>
-        <w:t xml:space="preserve">I know I’ve got the right. I’m not asking you. I’m telling you.</w:t>
+        <w:t xml:space="preserve">I know I have the right. I am not asking you. I am telling you.</w:t>
       </w:r>
       <w:r>
         <w:t xml:space="preserve">’</w:t>
@@ -31059,36 +31059,36 @@
         <w:t xml:space="preserve">‘</w:t>
       </w:r>
       <w:r>
-        <w:t xml:space="preserve">It hurt. It still hurts. And I’m angry. And I love you.</w:t>
-      </w:r>
-      <w:r>
-        <w:t xml:space="preserve">’</w:t>
-      </w:r>
-      <w:r>
-        <w:t xml:space="preserve"> </w:t>
-      </w:r>
-      <w:r>
-        <w:t xml:space="preserve">I count on my fingers, so I won’t forget any of them.</w:t>
-      </w:r>
-      <w:r>
-        <w:t xml:space="preserve"> </w:t>
-      </w:r>
-      <w:r>
-        <w:t xml:space="preserve">‘</w:t>
-      </w:r>
-      <w:r>
-        <w:t xml:space="preserve">The three things. I don’t know if I love you because of the sketchbook or because of me. But the other two are mine for sure.</w:t>
-      </w:r>
-      <w:r>
-        <w:t xml:space="preserve">’</w:t>
-      </w:r>
-    </w:p>
-    <w:p>
-      <w:pPr>
-        <w:pStyle w:val="BodyText"/>
-      </w:pPr>
-      <w:r>
-        <w:t xml:space="preserve">She doesn’t say anything. She comes to the table. She sits down across from me.</w:t>
+        <w:t xml:space="preserve">It hurt. It still hurts. And I am angry. And I love you.</w:t>
+      </w:r>
+      <w:r>
+        <w:t xml:space="preserve">’</w:t>
+      </w:r>
+      <w:r>
+        <w:t xml:space="preserve"> </w:t>
+      </w:r>
+      <w:r>
+        <w:t xml:space="preserve">I count on my fingers, so I will not forget any of them.</w:t>
+      </w:r>
+      <w:r>
+        <w:t xml:space="preserve"> </w:t>
+      </w:r>
+      <w:r>
+        <w:t xml:space="preserve">‘</w:t>
+      </w:r>
+      <w:r>
+        <w:t xml:space="preserve">The three things. I do not know if I love you because of the sketchbook or because of me. But the other two are mine. I am sure.</w:t>
+      </w:r>
+      <w:r>
+        <w:t xml:space="preserve">’</w:t>
+      </w:r>
+    </w:p>
+    <w:p>
+      <w:pPr>
+        <w:pStyle w:val="BodyText"/>
+      </w:pPr>
+      <w:r>
+        <w:t xml:space="preserve">She does not say anything. She comes to the table. She sits down across from me.</w:t>
       </w:r>
     </w:p>
     <w:p>
@@ -31104,7 +31104,7 @@
         <w:pStyle w:val="BodyText"/>
       </w:pPr>
       <w:r>
-        <w:t xml:space="preserve">That she didn’t go into the water to die. That she is telling me because I spent a whole day on the rocks thinking that, and she doesn’t want me to keep thinking it. That she went in because her head was full of noise and the cold was the only thing that made it quiet. That it was a stupid thing, that she knows it, that she has never done anything so stupid.</w:t>
+        <w:t xml:space="preserve">That she did not go into the water to die. That she is telling me because I spent a whole day on the rocks thinking that, and she does not want me to think it any more. That she went in because her head was full of noise and the cold was the only thing that made it quiet. That it was a stupid thing, that she knows it, that she has never done anything so stupid.</w:t>
       </w:r>
     </w:p>
     <w:p>
@@ -31173,7 +31173,7 @@
         <w:t xml:space="preserve">‘</w:t>
       </w:r>
       <w:r>
-        <w:t xml:space="preserve">tell me. I don’t know how to make it quiet. But I can make weak coffee.</w:t>
+        <w:t xml:space="preserve">tell me. I do not know how to make it quiet. But I can make weak coffee.</w:t>
       </w:r>
       <w:r>
         <w:t xml:space="preserve">’</w:t>
@@ -31243,7 +31243,7 @@
         <w:pStyle w:val="BodyText"/>
       </w:pPr>
       <w:r>
-        <w:t xml:space="preserve">I don’t understand.</w:t>
+        <w:t xml:space="preserve">I do not understand.</w:t>
       </w:r>
     </w:p>
     <w:p>
@@ -31327,7 +31327,7 @@
         <w:pStyle w:val="BodyText"/>
       </w:pPr>
       <w:r>
-        <w:t xml:space="preserve">I don’t know if I understand it yet. I think I will understand it later, when I tell it. That she isn’t giving me a sketchbook. She is giving me the pencil. She is giving me the only thing that made her stronger than me.</w:t>
+        <w:t xml:space="preserve">I think I understand it now, while I tell it. That she is not giving me a sketchbook. She is giving me the pencil. She is giving me the only thing that made her stronger than me.</w:t>
       </w:r>
     </w:p>
     <w:p>
@@ -31346,7 +31346,7 @@
         <w:t xml:space="preserve">‘</w:t>
       </w:r>
       <w:r>
-        <w:t xml:space="preserve">Don’t ask me where I keep it,</w:t>
+        <w:t xml:space="preserve">Do not ask me where I keep it,</w:t>
       </w:r>
       <w:r>
         <w:t xml:space="preserve">’</w:t>
@@ -31377,7 +31377,7 @@
         <w:pStyle w:val="BodyText"/>
       </w:pPr>
       <w:r>
-        <w:t xml:space="preserve">And she doesn’t ask me.</w:t>
+        <w:t xml:space="preserve">And she does not ask me.</w:t>
       </w:r>
     </w:p>
     <w:p>
@@ -31400,7 +31400,7 @@
         <w:pStyle w:val="BodyText"/>
       </w:pPr>
       <w:r>
-        <w:t xml:space="preserve">I don’t ask her. I tell her. She nods from the table, with her eyes on the monitors, and I see her clench her teeth. But she gives me money for the bread.</w:t>
+        <w:t xml:space="preserve">I do not ask her. I tell her. She nods from the table, with her eyes on the monitors, and I see her clench her teeth. But she gives me money for the bread.</w:t>
       </w:r>
     </w:p>
     <w:p>
@@ -31416,7 +31416,7 @@
         <w:pStyle w:val="BodyText"/>
       </w:pPr>
       <w:r>
-        <w:t xml:space="preserve">In the bakery there are three women. They go quiet when I come in. They look at me the way people look at the clouds when they don’t know if it’s going to rain.</w:t>
+        <w:t xml:space="preserve">In the bakery there are three women. They stop talking when I come in. They look at me the way people look at the clouds when they do not know if it is going to rain.</w:t>
       </w:r>
     </w:p>
     <w:p>
@@ -31475,7 +31475,7 @@
         <w:t xml:space="preserve">‘</w:t>
       </w:r>
       <w:r>
-        <w:t xml:space="preserve">I’m not her cousin.</w:t>
+        <w:t xml:space="preserve">I am not her cousin.</w:t>
       </w:r>
       <w:r>
         <w:t xml:space="preserve">’</w:t>
@@ -31524,7 +31524,7 @@
         <w:pStyle w:val="BodyText"/>
       </w:pPr>
       <w:r>
-        <w:t xml:space="preserve">Iter is not a name. It is a thing that happens to a weather model. I can’t say it out loud in front of three women with bread.</w:t>
+        <w:t xml:space="preserve">Iter is not a name. It is a thing that happens to a weather model. I cannot say it aloud in front of three women with bread.</w:t>
       </w:r>
     </w:p>
     <w:p>
@@ -31540,7 +31540,7 @@
         <w:pStyle w:val="BodyText"/>
       </w:pPr>
       <w:r>
-        <w:t xml:space="preserve">I hear them laughing behind me, softly, not meanly. Then one of them says something under her breath, about the sea, about me coming out of it. And another one says a word.</w:t>
+        <w:t xml:space="preserve">I hear them laugh behind me, softly, not meanly. Then one of them says something very low, about the sea, about me coming out of it. And another one says a word.</w:t>
       </w:r>
       <w:r>
         <w:t xml:space="preserve"> </w:t>
@@ -31558,15 +31558,15 @@
         <w:pStyle w:val="BodyText"/>
       </w:pPr>
       <w:r>
-        <w:t xml:space="preserve">I don’t know that word. I keep it.</w:t>
-      </w:r>
-    </w:p>
-    <w:p>
-      <w:pPr>
-        <w:pStyle w:val="BodyText"/>
-      </w:pPr>
-      <w:r>
-        <w:t xml:space="preserve">I go back to the lighthouse with the bread and with a new thing inside me that I don’t know the name of. It is heavy. It is like when the sky turns the colour of slate and it isn’t raining yet.</w:t>
+        <w:t xml:space="preserve">I do not know that word. I keep it.</w:t>
+      </w:r>
+    </w:p>
+    <w:p>
+      <w:pPr>
+        <w:pStyle w:val="BodyText"/>
+      </w:pPr>
+      <w:r>
+        <w:t xml:space="preserve">I go back to the lighthouse with the bread and with a new thing inside me that I do not know the name of. It is heavy. It is like when the sky turns the colour of slate and it is not raining yet.</w:t>
       </w:r>
     </w:p>
     <w:p>
@@ -33168,7 +33168,7 @@
         <w:pStyle w:val="BodyText"/>
       </w:pPr>
       <w:r>
-        <w:t xml:space="preserve">Three more knocks. Harder. These ones don’t wait.</w:t>
+        <w:t xml:space="preserve">Three more knocks. Harder. These do not wait.</w:t>
       </w:r>
     </w:p>
     <w:p>
@@ -33252,7 +33252,7 @@
         <w:pStyle w:val="BodyText"/>
       </w:pPr>
       <w:r>
-        <w:t xml:space="preserve">I don’t open it.</w:t>
+        <w:t xml:space="preserve">I do not open it.</w:t>
       </w:r>
     </w:p>
     <w:p>
@@ -33268,7 +33268,7 @@
         <w:pStyle w:val="BodyText"/>
       </w:pPr>
       <w:r>
-        <w:t xml:space="preserve">I don’t know why I do it. Nobody drew it for me. It comes from the same place that made me go down to the rocks to look for her.</w:t>
+        <w:t xml:space="preserve">I do not know why I do it. Nobody drew it for me. It comes from the same place that made me go down to the rocks to look for her.</w:t>
       </w:r>
     </w:p>
     <w:p>
@@ -33291,7 +33291,7 @@
         <w:pStyle w:val="FirstParagraph"/>
       </w:pPr>
       <w:r>
-        <w:t xml:space="preserve">I don’t know how long he knocks. The wind is rising. The rain is hitting the windows sideways. He knocks, and he talks, and his voice keeps changing.</w:t>
+        <w:t xml:space="preserve">I do not know how long he knocks. The wind is rising. The rain is hitting the windows sideways. He knocks, and he talks, and his voice changes and changes.</w:t>
       </w:r>
     </w:p>
     <w:p>
@@ -33369,23 +33369,23 @@
         <w:pStyle w:val="BodyText"/>
       </w:pPr>
       <w:r>
-        <w:t xml:space="preserve">And the door flies open and knocks me to the floor.</w:t>
-      </w:r>
-    </w:p>
-    <w:p>
-      <w:pPr>
-        <w:pStyle w:val="BodyText"/>
-      </w:pPr>
-      <w:r>
-        <w:t xml:space="preserve">I didn’t shoot the bolt right. Me. When we came back from the harbour. I pushed it wrong, in a hurry, with my head on the blue folder. I didn’t know you had to push it all the way. Nobody told me.</w:t>
-      </w:r>
-    </w:p>
-    <w:p>
-      <w:pPr>
-        <w:pStyle w:val="BodyText"/>
-      </w:pPr>
-      <w:r>
-        <w:t xml:space="preserve">Or they did. Ada told me once. And I didn’t write it down anywhere.</w:t>
+        <w:t xml:space="preserve">And the door opens all at once and throws me to the floor.</w:t>
+      </w:r>
+    </w:p>
+    <w:p>
+      <w:pPr>
+        <w:pStyle w:val="BodyText"/>
+      </w:pPr>
+      <w:r>
+        <w:t xml:space="preserve">I did not close the bolt well. Me. When we came back from the harbour. I pushed it wrong, in a hurry, with my head on the blue folder. I did not know you had to push it to the end. Nobody told me.</w:t>
+      </w:r>
+    </w:p>
+    <w:p>
+      <w:pPr>
+        <w:pStyle w:val="BodyText"/>
+      </w:pPr>
+      <w:r>
+        <w:t xml:space="preserve">Or they did. Ada told me once. And I did not write it anywhere.</w:t>
       </w:r>
     </w:p>
     <w:p>
@@ -33416,15 +33416,15 @@
         <w:pStyle w:val="BodyText"/>
       </w:pPr>
       <w:r>
-        <w:t xml:space="preserve">But he doesn’t stay on the doormat.</w:t>
-      </w:r>
-    </w:p>
-    <w:p>
-      <w:pPr>
-        <w:pStyle w:val="BodyText"/>
-      </w:pPr>
-      <w:r>
-        <w:t xml:space="preserve">He steps over me. He doesn’t look at me. He goes straight towards her, and she has stood up and is backing towards the kitchen with the folder against her chest.</w:t>
+        <w:t xml:space="preserve">But he does not stay on the doormat.</w:t>
+      </w:r>
+    </w:p>
+    <w:p>
+      <w:pPr>
+        <w:pStyle w:val="BodyText"/>
+      </w:pPr>
+      <w:r>
+        <w:t xml:space="preserve">He steps over me. He does not look at me. He goes straight towards her, and she has stood up and is walking backwards towards the kitchen with the folder against her chest.</w:t>
       </w:r>
     </w:p>
     <w:p>
@@ -33516,7 +33516,7 @@
         <w:pStyle w:val="BodyText"/>
       </w:pPr>
       <w:r>
-        <w:t xml:space="preserve">It is Ada’s word. The one she said to him at the harbour. I borrow it. I don’t think she minds.</w:t>
+        <w:t xml:space="preserve">It is Ada’s word. The one she said to him at the harbour. I borrow it. I do not think she minds.</w:t>
       </w:r>
     </w:p>
     <w:p>
@@ -33532,7 +33532,7 @@
         <w:pStyle w:val="BodyText"/>
       </w:pPr>
       <w:r>
-        <w:t xml:space="preserve">It isn’t a blow. It is a shove on the chest, with his open hand, the way you push a curtain aside.</w:t>
+        <w:t xml:space="preserve">It is not a blow. It is a shove on the chest, with his open hand, the way you push a curtain aside.</w:t>
       </w:r>
     </w:p>
     <w:p>
@@ -33623,7 +33623,7 @@
         <w:t xml:space="preserve"> </w:t>
       </w:r>
       <w:r>
-        <w:t xml:space="preserve">he says. He isn’t smiling any more.</w:t>
+        <w:t xml:space="preserve">he says. He is not smiling any more.</w:t>
       </w:r>
       <w:r>
         <w:t xml:space="preserve"> </w:t>
@@ -33681,7 +33681,7 @@
         <w:pStyle w:val="BodyText"/>
       </w:pPr>
       <w:r>
-        <w:t xml:space="preserve">I don’t recognise her voice.</w:t>
+        <w:t xml:space="preserve">I do not recognise her voice.</w:t>
       </w:r>
     </w:p>
     <w:p>
@@ -33750,7 +33750,7 @@
         <w:pStyle w:val="FirstParagraph"/>
       </w:pPr>
       <w:r>
-        <w:t xml:space="preserve">We both go after him.</w:t>
+        <w:t xml:space="preserve">We both follow him.</w:t>
       </w:r>
     </w:p>
     <w:p>
@@ -33774,7 +33774,7 @@
         <w:pStyle w:val="BodyText"/>
       </w:pPr>
       <w:r>
-        <w:t xml:space="preserve">He is holding the sketchbook up high. The pages are flapping like a trapped bird.</w:t>
+        <w:t xml:space="preserve">He holds the sketchbook high. The pages are flapping like a trapped bird.</w:t>
       </w:r>
     </w:p>
     <w:p>
@@ -33853,7 +33853,7 @@
         <w:pStyle w:val="FirstParagraph"/>
       </w:pPr>
       <w:r>
-        <w:t xml:space="preserve">I don’t see it fall.</w:t>
+        <w:t xml:space="preserve">I do not see it fall.</w:t>
       </w:r>
     </w:p>
     <w:p>
@@ -33901,15 +33901,15 @@
         <w:pStyle w:val="BodyText"/>
       </w:pPr>
       <w:r>
-        <w:t xml:space="preserve">What Ada traces on the paper, I am. The nose, the eyes, the hands. If she draws me a smile, the mouth smiles. If she rubs out my mouth, I have no voice.</w:t>
-      </w:r>
-    </w:p>
-    <w:p>
-      <w:pPr>
-        <w:pStyle w:val="BodyText"/>
-      </w:pPr>
-      <w:r>
-        <w:t xml:space="preserve">What I live is not on the paper. The coffee, the cold of the sea, the first time something hurt me. That she can’t draw or rub out. But if she redraws a whole part of me, it comes back the way it was on the paper, and what I lived stays outside. Like the scar from the wire.</w:t>
+        <w:t xml:space="preserve">What Ada traces on the paper, I am. The nose, the eyes, the hands. If she draws me a smile, the mouth smiles. If she erases my mouth, I have no voice.</w:t>
+      </w:r>
+    </w:p>
+    <w:p>
+      <w:pPr>
+        <w:pStyle w:val="BodyText"/>
+      </w:pPr>
+      <w:r>
+        <w:t xml:space="preserve">What I live is not on the paper. The coffee, the cold of the sea, the first time something hurt me. That she cannot draw or erase. But if she redraws a whole part of me, it comes back the way it was on the paper, and what I lived stays outside. Like the scar from the wire.</w:t>
       </w:r>
     </w:p>
     <w:p>
@@ -33925,7 +33925,7 @@
         <w:pStyle w:val="BodyText"/>
       </w:pPr>
       <w:r>
-        <w:t xml:space="preserve">I have known it for weeks. What I didn’t know is that it feels like this.</w:t>
+        <w:t xml:space="preserve">I have known it for weeks. What I did not know is that it feels like this.</w:t>
       </w:r>
     </w:p>
     <w:p>
@@ -33949,7 +33949,7 @@
         <w:pStyle w:val="BodyText"/>
       </w:pPr>
       <w:r>
-        <w:t xml:space="preserve">I don’t know what he sees. A man coming apart. A man you can see the rain through. Something that can’t be. Something that for three years he told Ada didn’t exist, that she was making it up, that she was ill.</w:t>
+        <w:t xml:space="preserve">I do not know what he sees. A man coming apart. A man you can see the rain through. Something that cannot be. Something that for three years he told Ada did not exist, that she was making it up, that she was ill.</w:t>
       </w:r>
     </w:p>
     <w:p>
@@ -33973,7 +33973,7 @@
         <w:pStyle w:val="BodyText"/>
       </w:pPr>
       <w:r>
-        <w:t xml:space="preserve">And he doesn’t leave. He stands still in the rain, two yards away, with his hand still open.</w:t>
+        <w:t xml:space="preserve">And he does not leave. He stands still in the rain, two yards away, with his hand still open.</w:t>
       </w:r>
     </w:p>
     <w:p>
@@ -34037,15 +34037,15 @@
         <w:pStyle w:val="BodyText"/>
       </w:pPr>
       <w:r>
-        <w:t xml:space="preserve">He doesn’t move. Then he does. He takes a step towards me. Another. He crouches in front of me, his blue coat dragging in the mud, and he reaches out his hand. The same hand. The way you bring your hand close to something that burns.</w:t>
-      </w:r>
-    </w:p>
-    <w:p>
-      <w:pPr>
-        <w:pStyle w:val="BodyText"/>
-      </w:pPr>
-      <w:r>
-        <w:t xml:space="preserve">He touches my shoulder. Where he touched it at the harbour. Where he said in my ear what he said, which I haven’t told Ada and am not going to tell here. Not yet.</w:t>
+        <w:t xml:space="preserve">He does not move. Then he moves. He takes a step towards me. Another. He crouches in front of me, his blue coat dragging in the mud, and he reaches out his hand. The same hand. The way you bring your hand close to something that burns.</w:t>
+      </w:r>
+    </w:p>
+    <w:p>
+      <w:pPr>
+        <w:pStyle w:val="BodyText"/>
+      </w:pPr>
+      <w:r>
+        <w:t xml:space="preserve">He touches my shoulder. Where he touched it at the harbour. Where he said in my ear what he said, which I have not told Ada and am not going to tell here. Not yet.</w:t>
       </w:r>
     </w:p>
     <w:p>
@@ -34069,7 +34069,7 @@
         <w:pStyle w:val="BodyText"/>
       </w:pPr>
       <w:r>
-        <w:t xml:space="preserve">I see him understand it. Not all at once. In layers, the way you understand bad news on the phone. First his face goes blank. Then his mouth goes slack. Then something in his shoulders, which he always keeps high, squared, a man who walks into a room and takes it over, comes down.</w:t>
+        <w:t xml:space="preserve">I see him understand it. Not all at once. In layers, the way you understand bad news on the phone. First his face goes blank. Then his mouth goes slack. Then something in his shoulders, which he always keeps high, squared, a man who walks into a room and takes it, comes down.</w:t>
       </w:r>
     </w:p>
     <w:p>
@@ -34089,7 +34089,7 @@
         <w:t xml:space="preserve"> </w:t>
       </w:r>
       <w:r>
-        <w:t xml:space="preserve">he says. Very low. He isn’t saying it to me.</w:t>
+        <w:t xml:space="preserve">he says. Very low. He is not saying it to me.</w:t>
       </w:r>
     </w:p>
     <w:p>
@@ -34105,7 +34105,7 @@
         <w:pStyle w:val="BodyText"/>
       </w:pPr>
       <w:r>
-        <w:t xml:space="preserve">Ada is on her knees beside me, with her hands on mine, unable to hold them. He looks at her. It isn’t the look from the kitchen, or from the harbour, or any of the ones I have seen on him. It is the look of a child who has got lost in a railway station and has just understood that nobody is coming to find him. He looks at her the way you look at a stranger. He knew she drew: three years calling it little drawings. What he didn’t know was who. That since she was a girl, in the margins of all her sketchbooks, another man had been waiting for her. And that next to him she had stopped drawing him. He never knew her.</w:t>
+        <w:t xml:space="preserve">Ada is on her knees beside me, with her hands on mine, unable to hold them. He looks at her. It is not the look from the kitchen, or from the harbour, or any of the ones I have seen on him. It is the look of a child who has got lost in a railway station and has just understood that nobody is coming to find him. He looks at her the way you look at a stranger. He knew she drew: three years calling it little drawings. What he did not know was who. That since she was a girl, in the margins of all her sketchbooks, another man had been waiting for her. And that next to him she had stopped drawing him. He never knew her.</w:t>
       </w:r>
     </w:p>
     <w:p>
@@ -34157,15 +34157,15 @@
         <w:pStyle w:val="BodyText"/>
       </w:pPr>
       <w:r>
-        <w:t xml:space="preserve">She doesn’t shout it. She says it with the rain running down her face, the way you say the time.</w:t>
-      </w:r>
-    </w:p>
-    <w:p>
-      <w:pPr>
-        <w:pStyle w:val="BodyText"/>
-      </w:pPr>
-      <w:r>
-        <w:t xml:space="preserve">He doesn’t move.</w:t>
+        <w:t xml:space="preserve">She does not shout it. She says it with the rain running down her face, the way you say the time.</w:t>
+      </w:r>
+    </w:p>
+    <w:p>
+      <w:pPr>
+        <w:pStyle w:val="BodyText"/>
+      </w:pPr>
+      <w:r>
+        <w:t xml:space="preserve">He does not move.</w:t>
       </w:r>
     </w:p>
     <w:p>
@@ -34201,7 +34201,7 @@
         <w:pStyle w:val="BodyText"/>
       </w:pPr>
       <w:r>
-        <w:t xml:space="preserve">She doesn’t watch him go. She is already running.</w:t>
+        <w:t xml:space="preserve">She does not watch him go. She is already running.</w:t>
       </w:r>
     </w:p>
     <w:p>
@@ -34225,7 +34225,7 @@
         <w:pStyle w:val="BodyText"/>
       </w:pPr>
       <w:r>
-        <w:t xml:space="preserve">I get up. I don’t know with what legs. I can’t see them well any more.</w:t>
+        <w:t xml:space="preserve">I get up. I do not know with what legs. I cannot see them well any more.</w:t>
       </w:r>
     </w:p>
     <w:p>
@@ -35348,7 +35348,7 @@
         <w:pStyle w:val="BodyText"/>
       </w:pPr>
       <w:r>
-        <w:t xml:space="preserve">It has happened to me once before. When Ada erased my mouth on the gallery I didn’t go quiet. Quiet is when you have the words and don’t say them. I had the words and nowhere to put them. It was like being inside a room with no door, shouting, and the shout not even reaching the wall.</w:t>
+        <w:t xml:space="preserve">It has happened to me once before. When Ada erased my mouth on the gallery I did not go quiet. Quiet is when you have the words and do not say them. I had the words and nowhere to put them. It was like being inside a room with no door, shouting, and the shout not even reaching the wall.</w:t>
       </w:r>
     </w:p>
     <w:p>
@@ -35492,7 +35492,7 @@
         <w:pStyle w:val="BodyText"/>
       </w:pPr>
       <w:r>
-        <w:t xml:space="preserve">They don’t say anything else.</w:t>
+        <w:t xml:space="preserve">They do not say anything else.</w:t>
       </w:r>
     </w:p>
     <w:p>
@@ -35515,7 +35515,7 @@
         <w:pStyle w:val="FirstParagraph"/>
       </w:pPr>
       <w:r>
-        <w:t xml:space="preserve">She doesn’t draw in the sketchbook. The sketchbook is pulp.</w:t>
+        <w:t xml:space="preserve">She does not draw in the sketchbook. The sketchbook is pulp.</w:t>
       </w:r>
     </w:p>
     <w:p>
@@ -35570,7 +35570,7 @@
         <w:pStyle w:val="FirstParagraph"/>
       </w:pPr>
       <w:r>
-        <w:t xml:space="preserve">I don’t know how to tell what I feel. I am going to try.</w:t>
+        <w:t xml:space="preserve">I do not know how to tell what I feel. I try, now, while I tell it.</w:t>
       </w:r>
     </w:p>
     <w:p>
@@ -35586,7 +35586,7 @@
         <w:pStyle w:val="BodyText"/>
       </w:pPr>
       <w:r>
-        <w:t xml:space="preserve">First the eyes. I feel them clear. The fog pulls back a little. I see her for real, her hair dripping, her face scrunched up in concentration, biting her lip.</w:t>
+        <w:t xml:space="preserve">First the eyes. I feel them clear. The fog goes back a little. I see her truly, her hair dripping, her face tight with attention, biting her lip.</w:t>
       </w:r>
     </w:p>
     <w:p>
@@ -35602,7 +35602,7 @@
         <w:pStyle w:val="BodyText"/>
       </w:pPr>
       <w:r>
-        <w:t xml:space="preserve">Then something I don’t expect.</w:t>
+        <w:t xml:space="preserve">Then something I do not expect.</w:t>
       </w:r>
     </w:p>
     <w:p>
@@ -35642,7 +35642,7 @@
         <w:pStyle w:val="BodyText"/>
       </w:pPr>
       <w:r>
-        <w:t xml:space="preserve">She isn’t drawing me the way she imagined me.</w:t>
+        <w:t xml:space="preserve">She is not drawing me the way she imagined me.</w:t>
       </w:r>
     </w:p>
     <w:p>
@@ -35673,7 +35673,7 @@
         <w:pStyle w:val="BodyText"/>
       </w:pPr>
       <w:r>
-        <w:t xml:space="preserve">Hands are always hard for her. I have heard her say so a thousand times. This time she doesn’t complain. She draws slowly. The long fingers. The knuckles.</w:t>
+        <w:t xml:space="preserve">Hands are always hard for her. I have heard her say so a thousand times. This time she does not complain. She draws slowly. The long fingers. The knuckles.</w:t>
       </w:r>
     </w:p>
     <w:p>
@@ -35729,7 +35729,7 @@
         <w:pStyle w:val="BodyText"/>
       </w:pPr>
       <w:r>
-        <w:t xml:space="preserve">What she has seen, she gives back to me. What she didn’t see is gone. And what I live from now on will be mine.</w:t>
+        <w:t xml:space="preserve">What she has seen, she gives back to me. What she did not see is gone. And what I live from now on will be mine.</w:t>
       </w:r>
     </w:p>
     <w:p>
@@ -35744,7 +35744,7 @@
         <w:pStyle w:val="FirstParagraph"/>
       </w:pPr>
       <w:r>
-        <w:t xml:space="preserve">The man in the rain jacket doesn’t move the whole time. He kneels on the other side of the blanket, his hands on his knees, watching me come back.</w:t>
+        <w:t xml:space="preserve">The man in the rain jacket does not move the whole time. He kneels on the other side of the blanket, his hands on his knees, watching me come back.</w:t>
       </w:r>
     </w:p>
     <w:p>
@@ -35760,15 +35760,15 @@
         <w:pStyle w:val="BodyText"/>
       </w:pPr>
       <w:r>
-        <w:t xml:space="preserve">He doesn’t say anything.</w:t>
-      </w:r>
-    </w:p>
-    <w:p>
-      <w:pPr>
-        <w:pStyle w:val="BodyText"/>
-      </w:pPr>
-      <w:r>
-        <w:t xml:space="preserve">He doesn’t leave, like the other one.</w:t>
+        <w:t xml:space="preserve">He does not say anything.</w:t>
+      </w:r>
+    </w:p>
+    <w:p>
+      <w:pPr>
+        <w:pStyle w:val="BodyText"/>
+      </w:pPr>
+      <w:r>
+        <w:t xml:space="preserve">He does not leave, like the other one.</w:t>
       </w:r>
     </w:p>
     <w:p>
@@ -35815,7 +35815,7 @@
         <w:pStyle w:val="BodyText"/>
       </w:pPr>
       <w:r>
-        <w:t xml:space="preserve">I cough. Seawater comes out of my mouth. I roll onto my side. I prop myself up on my hands.</w:t>
+        <w:t xml:space="preserve">I cough. Seawater comes out of my mouth. I roll onto my side. I lift myself on my hands.</w:t>
       </w:r>
     </w:p>
     <w:p>
@@ -35831,7 +35831,7 @@
         <w:pStyle w:val="BodyText"/>
       </w:pPr>
       <w:r>
-        <w:t xml:space="preserve">Ada lets go of the carpenter’s pencil. She stays on her knees, looking at me, her hands open on her thighs, not touching me. Waiting.</w:t>
+        <w:t xml:space="preserve">Ada drops the carpenter’s pencil. She stays on her knees, looking at me, her hands open on her thighs, not touching me. Waiting.</w:t>
       </w:r>
     </w:p>
     <w:p>
@@ -35855,7 +35855,7 @@
         <w:pStyle w:val="BodyText"/>
       </w:pPr>
       <w:r>
-        <w:t xml:space="preserve">I don’t know what I want to say to her. Many things. That I was afraid in the sea. That she went into the water for me with a sketchbook against her chest, in a heavy swell, the way I went in for her the day of the rocks. That the other one watched me come apart and left when she told him to, and that I am glad. That I love her. That I think I love her with a part that isn’t on any paper.</w:t>
+        <w:t xml:space="preserve">I do not know what I want to say to her. Many things. That I was afraid in the sea. That she went into the water for me with a sketchbook against her chest, in a heavy swell, the way I went in for her the day of the rocks. That the other one watched me come apart and left when she told him to, and that I am glad. That I love her. That I think I love her with a part that is not on any paper.</w:t>
       </w:r>
     </w:p>
     <w:p>
@@ -35893,7 +35893,7 @@
         <w:pStyle w:val="BodyText"/>
       </w:pPr>
       <w:r>
-        <w:t xml:space="preserve">And she bursts out laughing. The laugh from the drawing. The one with the big nose and one eye higher than the other. The one I did of her on the gallery.</w:t>
+        <w:t xml:space="preserve">And she begins to laugh. The laugh from the drawing. The one with the big nose and one eye higher than the other. The one I did of her on the gallery.</w:t>
       </w:r>
     </w:p>
     <w:p>
@@ -35942,7 +35942,7 @@
         <w:t xml:space="preserve">‘</w:t>
       </w:r>
       <w:r>
-        <w:t xml:space="preserve">That’s why.</w:t>
+        <w:t xml:space="preserve">That is why.</w:t>
       </w:r>
       <w:r>
         <w:t xml:space="preserve">’</w:t>
@@ -35993,7 +35993,7 @@
         <w:pStyle w:val="BodyText"/>
       </w:pPr>
       <w:r>
-        <w:t xml:space="preserve">Ada pushes the wet hair off my forehead. The cowlick. It springs back up.</w:t>
+        <w:t xml:space="preserve">Ada pushes the wet hair off my forehead. The cowlick. It stands up again.</w:t>
       </w:r>
     </w:p>
     <w:p>
@@ -36021,7 +36021,7 @@
         <w:pStyle w:val="BodyText"/>
       </w:pPr>
       <w:r>
-        <w:t xml:space="preserve">She doesn’t ask me. She tells me.</w:t>
+        <w:t xml:space="preserve">She does not ask me. She tells me.</w:t>
       </w:r>
     </w:p>
     <w:p>
@@ -36137,6 +36137,14 @@
         <w:pStyle w:val="BodyText"/>
       </w:pPr>
       <w:r>
+        <w:t xml:space="preserve">At school they had taken the tawse to us for talking like that. Proper English, the master said, or nothing. It took a German with an oilcloth notebook to show me our words were worth writing down.</w:t>
+      </w:r>
+    </w:p>
+    <w:p>
+      <w:pPr>
+        <w:pStyle w:val="BodyText"/>
+      </w:pPr>
+      <w:r>
         <w:t xml:space="preserve">On the tenth day, the engine of my father’s boat died in the middle of Hoy Sound.</w:t>
       </w:r>
     </w:p>
@@ -36533,7 +36541,7 @@
         <w:t xml:space="preserve">‘</w:t>
       </w:r>
       <w:r>
-        <w:t xml:space="preserve">A fractal. It’s called the Julia set. It depends on a number. You change that number a tiny bit, one little digit, and you get a completely different figure. Like the weather models. You can spend your whole life drawing it and it always surprises you.</w:t>
+        <w:t xml:space="preserve">A fractal. It’s called the Julia set. You get it by iterating: the same small sum, over and over. It depends on a number. You change that number a tiny bit, one little digit, and you get a completely different figure. Like the weather models. You can spend your whole life drawing it and it always surprises you.</w:t>
       </w:r>
       <w:r>
         <w:t xml:space="preserve">’</w:t>
@@ -36641,7 +36649,7 @@
         <w:t xml:space="preserve">‘</w:t>
       </w:r>
       <w:r>
-        <w:t xml:space="preserve">I’m not putting it on you. I’m giving it to you. The names you put on things are so they won’t go away. This one is yours, so you can take it with you wherever you want to go.</w:t>
+        <w:t xml:space="preserve">I’m not pinning it on you. I’m giving it to you. The names you pin on things are there so they can’t leave. This one is yours, so you can take it with you wherever you want to go.</w:t>
       </w:r>
       <w:r>
         <w:t xml:space="preserve">’</w:t>
@@ -38352,7 +38360,7 @@
         <w:pStyle w:val="BodyText"/>
       </w:pPr>
       <w:r>
-        <w:t xml:space="preserve">I have said it eleven times since this morning. I counted them. To the dog. To the bathroom mirror. To a gull on the gallery railing, which didn’t flinch. To Magnus. To Ada’s grandmother, at the door of her house, with the smell of the pie coming out from behind her like a welcome.</w:t>
+        <w:t xml:space="preserve">I have said it eleven times since this morning. I counted them. To the dog. To the bathroom mirror. To a gull on the gallery railing, which did not move. To Magnus. To Ada’s grandmother, at the door of her house, with the smell of the pie coming out from behind her like a welcome.</w:t>
       </w:r>
     </w:p>
     <w:p>
@@ -38473,7 +38481,7 @@
         <w:pStyle w:val="BodyText"/>
       </w:pPr>
       <w:r>
-        <w:t xml:space="preserve">I don’t know what</w:t>
+        <w:t xml:space="preserve">I do not know what</w:t>
       </w:r>
       <w:r>
         <w:t xml:space="preserve"> </w:t>
@@ -38505,7 +38513,7 @@
         <w:pStyle w:val="BodyText"/>
       </w:pPr>
       <w:r>
-        <w:t xml:space="preserve">It is tuna, with pepper and onion, and the pastry falls apart. I burn my tongue. I don’t mind. It is the first time I have eaten something made by someone who isn’t Ada. The first time someone has put a plate in front of me without knowing where I come from.</w:t>
+        <w:t xml:space="preserve">It is tuna, with pepper and onion, and the pastry falls apart. I burn my tongue. I do not mind. It is the first time I have eaten something made by someone who is not Ada. The first time someone has put a plate in front of me without knowing where I come from.</w:t>
       </w:r>
     </w:p>
     <w:p>
@@ -38521,7 +38529,7 @@
         <w:pStyle w:val="BodyText"/>
       </w:pPr>
       <w:r>
-        <w:t xml:space="preserve">Gran doesn’t ask anything.</w:t>
+        <w:t xml:space="preserve">Gran does not ask anything.</w:t>
       </w:r>
     </w:p>
     <w:p>
@@ -38555,7 +38563,7 @@
         <w:pStyle w:val="BodyText"/>
       </w:pPr>
       <w:r>
-        <w:t xml:space="preserve">I don’t understand.</w:t>
+        <w:t xml:space="preserve">I do not understand.</w:t>
       </w:r>
     </w:p>
     <w:p>
@@ -38594,7 +38602,7 @@
         <w:t xml:space="preserve">‘</w:t>
       </w:r>
       <w:r>
-        <w:t xml:space="preserve">I don’t know,</w:t>
+        <w:t xml:space="preserve">I do not know,</w:t>
       </w:r>
       <w:r>
         <w:t xml:space="preserve">’</w:t>
@@ -38612,7 +38620,7 @@
         <w:t xml:space="preserve">‘</w:t>
       </w:r>
       <w:r>
-        <w:t xml:space="preserve">I’ve never tried.</w:t>
+        <w:t xml:space="preserve">I have never tried.</w:t>
       </w:r>
       <w:r>
         <w:t xml:space="preserve">’</w:t>
@@ -38681,7 +38689,7 @@
         <w:pStyle w:val="FirstParagraph"/>
       </w:pPr>
       <w:r>
-        <w:t xml:space="preserve">We walk back to the lighthouse, with the evening coming down.</w:t>
+        <w:t xml:space="preserve">We walk back to the lighthouse, with the evening falling.</w:t>
       </w:r>
     </w:p>
     <w:p>
@@ -38796,7 +38804,7 @@
         <w:pStyle w:val="BodyText"/>
       </w:pPr>
       <w:r>
-        <w:t xml:space="preserve">It doesn’t take long. She hasn’t really slept in days. She falls asleep in the bed upstairs with the red pencil still in her hand and the page of</w:t>
+        <w:t xml:space="preserve">It does not take long. She has not really slept in days. She falls asleep in the bed upstairs with the red pencil still in her hand and the page of</w:t>
       </w:r>
       <w:r>
         <w:t xml:space="preserve"> </w:t>
@@ -38828,7 +38836,7 @@
         <w:pStyle w:val="BodyText"/>
       </w:pPr>
       <w:r>
-        <w:t xml:space="preserve">The iron trunk is at the top, in the lantern, under the lamp. The same one where Ada locked the sketchbook away with a padlock. It hasn’t got a padlock any more. Inside there are things belonging to the keepers who lived here before her. A cap. A logbook with its covers swollen from the damp. And two manuals, in old-fashioned English, with pen-and-ink drawings:</w:t>
+        <w:t xml:space="preserve">The iron trunk is at the top, in the lantern, under the lamp. The same one where Ada locked the sketchbook away with a padlock. It has no padlock any more. Inside there are things belonging to the keepers who lived here before her. A cap. A logbook with its covers swollen from the damp. And two manuals, in old-fashioned English, with pen-and-ink drawings:</w:t>
       </w:r>
       <w:r>
         <w:t xml:space="preserve"> </w:t>
@@ -38865,7 +38873,7 @@
         <w:pStyle w:val="BodyText"/>
       </w:pPr>
       <w:r>
-        <w:t xml:space="preserve">I have read them all the way through. Three times. On the nights she slept and I didn’t.</w:t>
+        <w:t xml:space="preserve">I have read them to the end. Three times. On the nights she slept and I did not.</w:t>
       </w:r>
     </w:p>
     <w:p>
@@ -38888,7 +38896,7 @@
         <w:pStyle w:val="FirstParagraph"/>
       </w:pPr>
       <w:r>
-        <w:t xml:space="preserve">The auxiliary generator for the lamp is in the shed out the back. Not the small one for the house, the one Ada turns on every time the power goes off: the other one, the big one, the one nobody has started since eighty-seven. Rusted. With a layer of dust and nests.</w:t>
+        <w:t xml:space="preserve">The auxiliary generator for the lamp is in the shed behind the house. Not the small one for the house, the one Ada turns on every time the power fails: the other one, the big one, the one nobody has started since eighty-seven. Rusted. With a layer of dust and nests.</w:t>
       </w:r>
     </w:p>
     <w:p>
@@ -39055,7 +39063,7 @@
         <w:pStyle w:val="BodyText"/>
       </w:pPr>
       <w:r>
-        <w:t xml:space="preserve">It is the first thing I have done in the world that nobody drew me doing.</w:t>
+        <w:t xml:space="preserve">It is the first thing I have done in the world that nobody drew.</w:t>
       </w:r>
     </w:p>
     <w:p>
@@ -39070,7 +39078,7 @@
         <w:pStyle w:val="FirstParagraph"/>
       </w:pPr>
       <w:r>
-        <w:t xml:space="preserve">I don’t hear her come up.</w:t>
+        <w:t xml:space="preserve">I do not hear her come up.</w:t>
       </w:r>
     </w:p>
     <w:p>
@@ -39113,7 +39121,7 @@
         <w:t xml:space="preserve">‘</w:t>
       </w:r>
       <w:r>
-        <w:t xml:space="preserve">I lit it so you’d see it when you came back,</w:t>
+        <w:t xml:space="preserve">I lit it so you would see it when you came back,</w:t>
       </w:r>
       <w:r>
         <w:t xml:space="preserve">’</w:t>
@@ -39159,7 +39167,7 @@
         <w:t xml:space="preserve">‘</w:t>
       </w:r>
       <w:r>
-        <w:t xml:space="preserve">I don’t know.</w:t>
+        <w:t xml:space="preserve">I do not know.</w:t>
       </w:r>
       <w:r>
         <w:t xml:space="preserve">’</w:t>
@@ -39188,7 +39196,7 @@
         <w:pStyle w:val="BodyText"/>
       </w:pPr>
       <w:r>
-        <w:t xml:space="preserve">A sound escapes her. I don’t know if it is laughing or crying. Both.</w:t>
+        <w:t xml:space="preserve">A sound comes out of her. I do not know if it is laughing or crying. Both.</w:t>
       </w:r>
     </w:p>
     <w:p>
@@ -39227,7 +39235,7 @@
         <w:t xml:space="preserve">‘</w:t>
       </w:r>
       <w:r>
-        <w:t xml:space="preserve">It’s not for you.</w:t>
+        <w:t xml:space="preserve">It is not for you.</w:t>
       </w:r>
       <w:r>
         <w:t xml:space="preserve">’</w:t>
@@ -39281,7 +39289,7 @@
         <w:t xml:space="preserve">‘</w:t>
       </w:r>
       <w:r>
-        <w:t xml:space="preserve">For anyone who’s looking.</w:t>
+        <w:t xml:space="preserve">For anyone who is looking.</w:t>
       </w:r>
       <w:r>
         <w:t xml:space="preserve">’</w:t>
@@ -39373,15 +39381,15 @@
         <w:pStyle w:val="BodyText"/>
       </w:pPr>
       <w:r>
-        <w:t xml:space="preserve">I don’t know how she knows about the fourth time. I haven’t told her.</w:t>
-      </w:r>
-    </w:p>
-    <w:p>
-      <w:pPr>
-        <w:pStyle w:val="BodyText"/>
-      </w:pPr>
-      <w:r>
-        <w:t xml:space="preserve">I don’t ask. The same way she didn’t ask Magnus’s name. There are things you don’t ask because asking would be starting to want to know them, and others you don’t ask because you already know them.</w:t>
+        <w:t xml:space="preserve">I do not know how she knows about the fourth time. I have not told her.</w:t>
+      </w:r>
+    </w:p>
+    <w:p>
+      <w:pPr>
+        <w:pStyle w:val="BodyText"/>
+      </w:pPr>
+      <w:r>
+        <w:t xml:space="preserve">I do not ask. The same way she did not ask Magnus’s name. There are things you do not ask because asking would be starting to want to know them, and others you do not ask because you already know them.</w:t>
       </w:r>
     </w:p>
     <w:p>
@@ -39459,7 +39467,7 @@
         <w:pStyle w:val="BodyText"/>
       </w:pPr>
       <w:r>
-        <w:t xml:space="preserve">We stay like that a long time. Until it starts getting light behind the hill. Until she falls asleep again, against me, with her mouth a little open.</w:t>
+        <w:t xml:space="preserve">We stay like that a long time. Until it begins to be light behind the hill. Until she falls asleep again, against me, with her mouth a little open.</w:t>
       </w:r>
     </w:p>
     <w:p>
@@ -39482,7 +39490,7 @@
         <w:pStyle w:val="FirstParagraph"/>
       </w:pPr>
       <w:r>
-        <w:t xml:space="preserve">Before switching it off, I get up to look at the sea one last time from up here.</w:t>
+        <w:t xml:space="preserve">Before I switch it off, I stand up to look at the sea one last time from up here.</w:t>
       </w:r>
     </w:p>
     <w:p>
@@ -39570,7 +39578,7 @@
         <w:pStyle w:val="BodyText"/>
       </w:pPr>
       <w:r>
-        <w:t xml:space="preserve">I don’t look at the glass again.</w:t>
+        <w:t xml:space="preserve">I do not look at the glass again.</w:t>
       </w:r>
     </w:p>
     <w:p>
@@ -40261,6 +40269,24 @@
       </w:r>
       <w:r>
         <w:t xml:space="preserve">”</w:t>
+      </w:r>
+    </w:p>
+    <w:p>
+      <w:pPr>
+        <w:pStyle w:val="BodyText"/>
+      </w:pPr>
+      <w:r>
+        <w:rPr>
+          <w:iCs/>
+          <w:i/>
+        </w:rPr>
+        <w:t xml:space="preserve">tawse</w:t>
+      </w:r>
+      <w:r>
+        <w:t xml:space="preserve"> </w:t>
+      </w:r>
+      <w:r>
+        <w:t xml:space="preserve">— the leather strap Scottish schoolteachers used on pupils’ hands.</w:t>
       </w:r>
     </w:p>
     <w:p>

</xml_diff>